<commit_message>
fix(docs): format CO column - note HK for hau kiem, leave blank if no CO
</commit_message>
<xml_diff>
--- a/mau_form_chuan/QUYET_DINH_KHO_SEEDLOG_T07_2026_MAU_CHUAN.docx
+++ b/mau_form_chuan/QUYET_DINH_KHO_SEEDLOG_T07_2026_MAU_CHUAN.docx
@@ -98,7 +98,7 @@
           <w:b/>
           <w:sz w:val="23"/>
         </w:rPr>
-        <w:t>Về việc truy thu giá trị claim KHO SEEDLOG tháng 07/2026</w:t>
+        <w:t>Về việc truy thu giá trị claim KHO SEEDLOG tháng 08/2026</w:t>
         <w:br/>
         <w:t>-------------------------</w:t>
       </w:r>
@@ -113,7 +113,7 @@
           <w:rFonts w:ascii="Times New Roman" w:hAnsi="Times New Roman"/>
           <w:sz w:val="21"/>
         </w:rPr>
-        <w:t>- Căn cứ vào kết quả giao nhận và kiểm tra thực tế tháng 07/2026</w:t>
+        <w:t>- Căn cứ vào kết quả giao nhận và kiểm tra thực tế tháng 08/2026</w:t>
         <w:br/>
         <w:t>- Căn cứ kết quả đối chiếu của KFM và SCF</w:t>
       </w:r>
@@ -420,7 +420,7 @@
                 <w:rFonts w:ascii="Times New Roman" w:hAnsi="Times New Roman"/>
                 <w:sz w:val="18"/>
               </w:rPr>
-              <w:t>Tháng 07</w:t>
+              <w:t>Tháng 08</w:t>
             </w:r>
           </w:p>
         </w:tc>
@@ -487,9 +487,7 @@
                 <w:rFonts w:ascii="Times New Roman" w:hAnsi="Times New Roman"/>
                 <w:sz w:val="18"/>
               </w:rPr>
-              <w:t>CO804618,</w:t>
-              <w:br/>
-              <w:t>CO804622</w:t>
+              <w:t>CO804605</w:t>
             </w:r>
           </w:p>
         </w:tc>
@@ -553,7 +551,7 @@
                 <w:rFonts w:ascii="Times New Roman" w:hAnsi="Times New Roman"/>
                 <w:sz w:val="18"/>
               </w:rPr>
-              <w:t>(20,237,293)</w:t>
+              <w:t>(14,276,484)</w:t>
             </w:r>
           </w:p>
         </w:tc>
@@ -585,7 +583,7 @@
                 <w:rFonts w:ascii="Times New Roman" w:hAnsi="Times New Roman"/>
                 <w:sz w:val="18"/>
               </w:rPr>
-              <w:t>(21,815,446)</w:t>
+              <w:t>(15,470,638)</w:t>
             </w:r>
           </w:p>
         </w:tc>
@@ -696,7 +694,7 @@
                 <w:rFonts w:ascii="Times New Roman" w:hAnsi="Times New Roman"/>
                 <w:sz w:val="18"/>
               </w:rPr>
-              <w:t>CO804596</w:t>
+              <w:t>CO804600</w:t>
             </w:r>
           </w:p>
         </w:tc>
@@ -760,7 +758,7 @@
                 <w:rFonts w:ascii="Times New Roman" w:hAnsi="Times New Roman"/>
                 <w:sz w:val="18"/>
               </w:rPr>
-              <w:t>(5,214,694)</w:t>
+              <w:t>(15,995,981)</w:t>
             </w:r>
           </w:p>
         </w:tc>
@@ -792,7 +790,7 @@
                 <w:rFonts w:ascii="Times New Roman" w:hAnsi="Times New Roman"/>
                 <w:sz w:val="18"/>
               </w:rPr>
-              <w:t>(5,619,650)</w:t>
+              <w:t>(17,279,889)</w:t>
             </w:r>
           </w:p>
         </w:tc>
@@ -1082,7 +1080,7 @@
                 <w:rFonts w:ascii="Times New Roman" w:hAnsi="Times New Roman"/>
                 <w:sz w:val="18"/>
               </w:rPr>
-              <w:t>CO804600</w:t>
+              <w:t>CO804596</w:t>
             </w:r>
           </w:p>
         </w:tc>
@@ -1146,7 +1144,7 @@
                 <w:rFonts w:ascii="Times New Roman" w:hAnsi="Times New Roman"/>
                 <w:sz w:val="18"/>
               </w:rPr>
-              <w:t>(15,995,981)</w:t>
+              <w:t>(5,214,694)</w:t>
             </w:r>
           </w:p>
         </w:tc>
@@ -1178,7 +1176,7 @@
                 <w:rFonts w:ascii="Times New Roman" w:hAnsi="Times New Roman"/>
                 <w:sz w:val="18"/>
               </w:rPr>
-              <w:t>(17,279,889)</w:t>
+              <w:t>(5,619,650)</w:t>
             </w:r>
           </w:p>
         </w:tc>
@@ -1275,7 +1273,7 @@
                 <w:rFonts w:ascii="Times New Roman" w:hAnsi="Times New Roman"/>
                 <w:sz w:val="18"/>
               </w:rPr>
-              <w:t>CO804605</w:t>
+              <w:t>CO804618, CO804622</w:t>
             </w:r>
           </w:p>
         </w:tc>
@@ -1339,7 +1337,7 @@
                 <w:rFonts w:ascii="Times New Roman" w:hAnsi="Times New Roman"/>
                 <w:sz w:val="18"/>
               </w:rPr>
-              <w:t>(14,276,484)</w:t>
+              <w:t>(20,237,293)</w:t>
             </w:r>
           </w:p>
         </w:tc>
@@ -1371,7 +1369,7 @@
                 <w:rFonts w:ascii="Times New Roman" w:hAnsi="Times New Roman"/>
                 <w:sz w:val="18"/>
               </w:rPr>
-              <w:t>(15,470,638)</w:t>
+              <w:t>(21,815,446)</w:t>
             </w:r>
           </w:p>
         </w:tc>
@@ -1638,7 +1636,7 @@
           <w:rFonts w:ascii="Times New Roman" w:hAnsi="Times New Roman"/>
           <w:sz w:val="21"/>
         </w:rPr>
-        <w:t xml:space="preserve">• Chi phí KHO SEEDLOG T07/2026 (VAT): </w:t>
+        <w:t xml:space="preserve">• Chi phí KHO SEEDLOG T08/2026 (VAT): </w:t>
       </w:r>
       <w:r>
         <w:rPr>

</xml_diff>